<commit_message>
Add GitHub repo URL to proposal metadata and deliverables
Co-Authored-By: Claude Opus 4.6 <noreply@anthropic.com>
</commit_message>
<xml_diff>
--- a/ProjectReport/Proposal/IRS-PM-2026-03-29-AIS08-GRP-11-ThePlanner.docx
+++ b/ProjectReport/Proposal/IRS-PM-2026-03-29-AIS08-GRP-11-ThePlanner.docx
@@ -44,7 +44,7 @@
     <w:tbl>
       <w:tblPr>
         <w:tblStyle w:val="Table"/>
-        <w:tblW w:w="0" w:type="auto"/>
+        <w:tblW w:w="5000" w:type="pct"/>
         <w:jc w:val="center"/>
         <w:tblBorders>
           <w:top w:val="single" w:sz="4" w:space="0" w:color="000000"/>
@@ -57,8 +57,8 @@
         <w:tblLook w:val="0020" w:firstRow="1" w:lastRow="0" w:firstColumn="0" w:lastColumn="0" w:noHBand="0" w:noVBand="0"/>
       </w:tblPr>
       <w:tblGrid>
-        <w:gridCol w:w="1439"/>
-        <w:gridCol w:w="3480"/>
+        <w:gridCol w:w="2140"/>
+        <w:gridCol w:w="8156"/>
       </w:tblGrid>
       <w:tr>
         <w:trPr>
@@ -317,6 +317,55 @@
                 <w:rFonts w:ascii="Calibri" w:hAnsi="Calibri"/>
                 <w:sz w:val="18"/>
               </w:rPr>
+              <w:t>GitHub Repository</w:t>
+            </w:r>
+          </w:p>
+        </w:tc>
+        <w:tc>
+          <w:tcPr>
+            <w:tcW w:w="0" w:type="auto"/>
+          </w:tcPr>
+          <w:p>
+            <w:pPr>
+              <w:pStyle w:val="Compact"/>
+            </w:pPr>
+            <w:hyperlink r:id="rId7" w:history="1">
+              <w:r>
+                <w:rPr>
+                  <w:rStyle w:val="Hyperlink"/>
+                  <w:rFonts w:ascii="Calibri" w:hAnsi="Calibri"/>
+                  <w:sz w:val="18"/>
+                </w:rPr>
+                <w:t>https://github.com/chanwaijye/IRS-PM-2026-03-29-AIS08-GRP-11-ThePlanner</w:t>
+              </w:r>
+            </w:hyperlink>
+            <w:r>
+              <w:rPr>
+                <w:rFonts w:ascii="Calibri" w:hAnsi="Calibri"/>
+                <w:sz w:val="18"/>
+              </w:rPr>
+              <w:t xml:space="preserve"> </w:t>
+            </w:r>
+          </w:p>
+        </w:tc>
+      </w:tr>
+      <w:tr>
+        <w:trPr>
+          <w:jc w:val="center"/>
+        </w:trPr>
+        <w:tc>
+          <w:tcPr>
+            <w:tcW w:w="0" w:type="auto"/>
+          </w:tcPr>
+          <w:p>
+            <w:pPr>
+              <w:pStyle w:val="Compact"/>
+            </w:pPr>
+            <w:r>
+              <w:rPr>
+                <w:rFonts w:ascii="Calibri" w:hAnsi="Calibri"/>
+                <w:sz w:val="18"/>
+              </w:rPr>
               <w:t>Submission Type</w:t>
             </w:r>
           </w:p>
@@ -349,7 +398,7 @@
           <w:rFonts w:ascii="Calibri" w:hAnsi="Calibri"/>
           <w:sz w:val="22"/>
         </w:rPr>
-        <w:pict w14:anchorId="422A7187">
+        <w:pict w14:anchorId="6B27BE5E">
           <v:rect id="_x0000_i1025" style="width:0;height:1.5pt" o:hralign="center" o:hrstd="t" o:hr="t"/>
         </w:pict>
       </w:r>
@@ -1067,7 +1116,7 @@
           <w:rFonts w:ascii="Calibri" w:hAnsi="Calibri"/>
           <w:sz w:val="22"/>
         </w:rPr>
-        <w:pict w14:anchorId="71522181">
+        <w:pict w14:anchorId="6EBEFF20">
           <v:rect id="_x0000_i1026" style="width:0;height:1.5pt" o:hralign="center" o:hrstd="t" o:hr="t"/>
         </w:pict>
       </w:r>
@@ -1290,7 +1339,7 @@
           <w:rFonts w:ascii="Calibri" w:hAnsi="Calibri"/>
           <w:sz w:val="22"/>
         </w:rPr>
-        <w:pict w14:anchorId="76DC4D6B">
+        <w:pict w14:anchorId="304E6CE1">
           <v:rect id="_x0000_i1027" style="width:0;height:1.5pt" o:hralign="center" o:hrstd="t" o:hr="t"/>
         </w:pict>
       </w:r>
@@ -1513,7 +1562,7 @@
           <w:rFonts w:ascii="Calibri" w:hAnsi="Calibri"/>
           <w:sz w:val="22"/>
         </w:rPr>
-        <w:pict w14:anchorId="7C92EFF0">
+        <w:pict w14:anchorId="4BB3D020">
           <v:rect id="_x0000_i1028" style="width:0;height:1.5pt" o:hralign="center" o:hrstd="t" o:hr="t"/>
         </w:pict>
       </w:r>
@@ -1712,7 +1761,7 @@
           <w:rFonts w:ascii="Calibri" w:hAnsi="Calibri"/>
           <w:sz w:val="22"/>
         </w:rPr>
-        <w:pict w14:anchorId="2C0BC3F3">
+        <w:pict w14:anchorId="4C44340A">
           <v:rect id="_x0000_i1029" style="width:0;height:1.5pt" o:hralign="center" o:hrstd="t" o:hr="t"/>
         </w:pict>
       </w:r>
@@ -2106,7 +2155,7 @@
           <w:sz w:val="22"/>
         </w:rPr>
         <w:drawing>
-          <wp:inline distT="0" distB="0" distL="0" distR="0" wp14:anchorId="5A68FB32" wp14:editId="087996AB">
+          <wp:inline distT="0" distB="0" distL="0" distR="0" wp14:anchorId="6F8D4A5B" wp14:editId="1A6A8663">
             <wp:extent cx="2667000" cy="2958910"/>
             <wp:effectExtent l="0" t="0" r="0" b="0"/>
             <wp:docPr id="37" name="Picture"/>
@@ -2121,7 +2170,7 @@
                     </pic:cNvPicPr>
                   </pic:nvPicPr>
                   <pic:blipFill>
-                    <a:blip r:embed="rId7"/>
+                    <a:blip r:embed="rId8"/>
                     <a:stretch>
                       <a:fillRect/>
                     </a:stretch>
@@ -2157,14 +2206,21 @@
           <w:rFonts w:ascii="Calibri" w:hAnsi="Calibri"/>
           <w:sz w:val="22"/>
         </w:rPr>
-        <w:pict w14:anchorId="3B95C802">
+        <w:pict w14:anchorId="03B24B3A">
           <v:rect id="_x0000_i1030" style="width:0;height:1.5pt" o:hralign="center" o:hrstd="t" o:hr="t"/>
         </w:pict>
       </w:r>
     </w:p>
     <w:p>
       <w:pPr>
-        <w:pStyle w:val="Heading2"/>
+        <w:rPr>
+          <w:rFonts w:asciiTheme="majorHAnsi" w:eastAsiaTheme="majorEastAsia" w:hAnsiTheme="majorHAnsi" w:cstheme="majorBidi"/>
+          <w:b/>
+          <w:bCs/>
+          <w:color w:val="1F3864"/>
+          <w:sz w:val="32"/>
+          <w:szCs w:val="28"/>
+        </w:rPr>
       </w:pPr>
       <w:bookmarkStart w:id="18" w:name="system-design"/>
       <w:bookmarkEnd w:id="17"/>
@@ -2173,6 +2229,19 @@
           <w:color w:val="1F3864"/>
           <w:sz w:val="32"/>
         </w:rPr>
+        <w:br w:type="page"/>
+      </w:r>
+    </w:p>
+    <w:p>
+      <w:pPr>
+        <w:pStyle w:val="Heading2"/>
+      </w:pPr>
+      <w:r>
+        <w:rPr>
+          <w:color w:val="1F3864"/>
+          <w:sz w:val="32"/>
+        </w:rPr>
+        <w:lastRenderedPageBreak/>
         <w:t>5. System Design</w:t>
       </w:r>
     </w:p>
@@ -2212,9 +2281,8 @@
           <w:noProof/>
           <w:sz w:val="22"/>
         </w:rPr>
-        <w:lastRenderedPageBreak/>
         <w:drawing>
-          <wp:inline distT="0" distB="0" distL="0" distR="0" wp14:anchorId="7C26BCCE" wp14:editId="752620FF">
+          <wp:inline distT="0" distB="0" distL="0" distR="0" wp14:anchorId="69FC9994" wp14:editId="1A9CB4BC">
             <wp:extent cx="2667000" cy="6545620"/>
             <wp:effectExtent l="0" t="0" r="0" b="0"/>
             <wp:docPr id="41" name="Picture"/>
@@ -2229,7 +2297,7 @@
                     </pic:cNvPicPr>
                   </pic:nvPicPr>
                   <pic:blipFill>
-                    <a:blip r:embed="rId8"/>
+                    <a:blip r:embed="rId9"/>
                     <a:stretch>
                       <a:fillRect/>
                     </a:stretch>
@@ -2258,7 +2326,13 @@
     </w:p>
     <w:p>
       <w:pPr>
-        <w:pStyle w:val="Heading3"/>
+        <w:rPr>
+          <w:rFonts w:asciiTheme="majorHAnsi" w:eastAsiaTheme="majorEastAsia" w:hAnsiTheme="majorHAnsi" w:cstheme="majorBidi"/>
+          <w:b/>
+          <w:bCs/>
+          <w:color w:val="1F3864"/>
+          <w:sz w:val="26"/>
+        </w:rPr>
       </w:pPr>
       <w:bookmarkStart w:id="20" w:name="agent-specifications"/>
       <w:bookmarkEnd w:id="19"/>
@@ -2267,6 +2341,19 @@
           <w:color w:val="1F3864"/>
           <w:sz w:val="26"/>
         </w:rPr>
+        <w:br w:type="page"/>
+      </w:r>
+    </w:p>
+    <w:p>
+      <w:pPr>
+        <w:pStyle w:val="Heading3"/>
+      </w:pPr>
+      <w:r>
+        <w:rPr>
+          <w:color w:val="1F3864"/>
+          <w:sz w:val="26"/>
+        </w:rPr>
+        <w:lastRenderedPageBreak/>
         <w:t>5.2 Agent Specifications</w:t>
       </w:r>
     </w:p>
@@ -2618,7 +2705,6 @@
                 <w:bCs/>
                 <w:sz w:val="18"/>
               </w:rPr>
-              <w:lastRenderedPageBreak/>
               <w:t>Agent 4 — Executor</w:t>
             </w:r>
           </w:p>
@@ -4605,21 +4691,15 @@
           <w:rFonts w:ascii="Calibri" w:hAnsi="Calibri"/>
           <w:sz w:val="22"/>
         </w:rPr>
-        <w:pict w14:anchorId="52CCC1B5">
+        <w:lastRenderedPageBreak/>
+        <w:pict w14:anchorId="08CE4E57">
           <v:rect id="_x0000_i1031" style="width:0;height:1.5pt" o:hralign="center" o:hrstd="t" o:hr="t"/>
         </w:pict>
       </w:r>
     </w:p>
     <w:p>
       <w:pPr>
-        <w:rPr>
-          <w:rFonts w:asciiTheme="majorHAnsi" w:eastAsiaTheme="majorEastAsia" w:hAnsiTheme="majorHAnsi" w:cstheme="majorBidi"/>
-          <w:b/>
-          <w:bCs/>
-          <w:color w:val="1F3864"/>
-          <w:sz w:val="32"/>
-          <w:szCs w:val="28"/>
-        </w:rPr>
+        <w:pStyle w:val="Heading2"/>
       </w:pPr>
       <w:bookmarkStart w:id="23" w:name="data-collection-knowledge-sources"/>
       <w:bookmarkEnd w:id="18"/>
@@ -4629,27 +4709,7 @@
           <w:color w:val="1F3864"/>
           <w:sz w:val="32"/>
         </w:rPr>
-        <w:br w:type="page"/>
-      </w:r>
-    </w:p>
-    <w:p>
-      <w:pPr>
-        <w:pStyle w:val="Heading2"/>
-      </w:pPr>
-      <w:r>
-        <w:rPr>
-          <w:color w:val="1F3864"/>
-          <w:sz w:val="32"/>
-        </w:rPr>
-        <w:lastRenderedPageBreak/>
-        <w:t xml:space="preserve">6. </w:t>
-      </w:r>
-      <w:r>
-        <w:rPr>
-          <w:color w:val="1F3864"/>
-          <w:sz w:val="32"/>
-        </w:rPr>
-        <w:t>Data Collection &amp; Knowledge Sources</w:t>
+        <w:t>6. Data Collection &amp; Knowledge Sources</w:t>
       </w:r>
     </w:p>
     <w:p>
@@ -5532,37 +5592,18 @@
           <w:rFonts w:ascii="Calibri" w:hAnsi="Calibri"/>
           <w:sz w:val="22"/>
         </w:rPr>
-        <w:pict w14:anchorId="14302C53">
+        <w:pict w14:anchorId="6DA0225D">
           <v:rect id="_x0000_i1032" style="width:0;height:1.5pt" o:hralign="center" o:hrstd="t" o:hr="t"/>
         </w:pict>
       </w:r>
     </w:p>
     <w:p>
       <w:pPr>
-        <w:rPr>
-          <w:rFonts w:asciiTheme="majorHAnsi" w:eastAsiaTheme="majorEastAsia" w:hAnsiTheme="majorHAnsi" w:cstheme="majorBidi"/>
-          <w:b/>
-          <w:bCs/>
-          <w:color w:val="1F3864"/>
-          <w:sz w:val="32"/>
-          <w:szCs w:val="28"/>
-        </w:rPr>
+        <w:pStyle w:val="Heading2"/>
       </w:pPr>
       <w:bookmarkStart w:id="28" w:name="team-structure-ai-agent-collaboration"/>
       <w:bookmarkEnd w:id="23"/>
       <w:bookmarkEnd w:id="27"/>
-      <w:r>
-        <w:rPr>
-          <w:color w:val="1F3864"/>
-          <w:sz w:val="32"/>
-        </w:rPr>
-        <w:br w:type="page"/>
-      </w:r>
-    </w:p>
-    <w:p>
-      <w:pPr>
-        <w:pStyle w:val="Heading2"/>
-      </w:pPr>
       <w:r>
         <w:rPr>
           <w:color w:val="1F3864"/>
@@ -6614,7 +6655,14 @@
           <w:rFonts w:ascii="Calibri" w:hAnsi="Calibri"/>
           <w:sz w:val="22"/>
         </w:rPr>
-        <w:t xml:space="preserve"> Approximately 10 man-days by the sole human contributor, as required by the module. Claude Code and its 5 coding subagents accelerate implementation of each module but operate under the team leader’s direction — the human defines all I/O contracts, reviews all generated code, and owns all architectural decisions. All submitted code is reviewed and validated by the team leader.</w:t>
+        <w:t xml:space="preserve"> </w:t>
+      </w:r>
+      <w:r>
+        <w:rPr>
+          <w:rFonts w:ascii="Calibri" w:hAnsi="Calibri"/>
+          <w:sz w:val="22"/>
+        </w:rPr>
+        <w:t>Approximately 10 man-days by the sole human contributor, as required by the module. Claude Code and its 5 coding subagents accelerate implementation of each module but operate under the team leader’s direction — the human defines all I/O contracts, reviews all generated code, and owns all architectural decisions. All submitted code is reviewed and validated by the team leader.</w:t>
       </w:r>
     </w:p>
     <w:p>
@@ -6644,7 +6692,7 @@
         </w:rPr>
         <w:lastRenderedPageBreak/>
         <w:drawing>
-          <wp:inline distT="0" distB="0" distL="0" distR="0" wp14:anchorId="17213164" wp14:editId="6F707682">
+          <wp:inline distT="0" distB="0" distL="0" distR="0" wp14:anchorId="335343EB" wp14:editId="1C616B36">
             <wp:extent cx="5867400" cy="2334985"/>
             <wp:effectExtent l="0" t="0" r="0" b="0"/>
             <wp:docPr id="54" name="Picture"/>
@@ -6659,7 +6707,7 @@
                     </pic:cNvPicPr>
                   </pic:nvPicPr>
                   <pic:blipFill>
-                    <a:blip r:embed="rId9"/>
+                    <a:blip r:embed="rId10"/>
                     <a:stretch>
                       <a:fillRect/>
                     </a:stretch>
@@ -6695,7 +6743,7 @@
           <w:rFonts w:ascii="Calibri" w:hAnsi="Calibri"/>
           <w:sz w:val="22"/>
         </w:rPr>
-        <w:pict w14:anchorId="487F475F">
+        <w:pict w14:anchorId="605AAC1D">
           <v:rect id="_x0000_i1033" style="width:0;height:1.5pt" o:hralign="center" o:hrstd="t" o:hr="t"/>
         </w:pict>
       </w:r>
@@ -7219,7 +7267,7 @@
           <w:rFonts w:ascii="Calibri" w:hAnsi="Calibri"/>
           <w:sz w:val="22"/>
         </w:rPr>
-        <w:pict w14:anchorId="55E1E1F3">
+        <w:pict w14:anchorId="1189C8E7">
           <v:rect id="_x0000_i1034" style="width:0;height:1.5pt" o:hralign="center" o:hrstd="t" o:hr="t"/>
         </w:pict>
       </w:r>
@@ -8290,7 +8338,7 @@
           <w:rFonts w:ascii="Calibri" w:hAnsi="Calibri"/>
           <w:sz w:val="22"/>
         </w:rPr>
-        <w:pict w14:anchorId="55A60A55">
+        <w:pict w14:anchorId="6DECFCC3">
           <v:rect id="_x0000_i1035" style="width:0;height:1.5pt" o:hralign="center" o:hrstd="t" o:hr="t"/>
         </w:pict>
       </w:r>
@@ -8797,7 +8845,7 @@
           <w:sz w:val="22"/>
         </w:rPr>
         <w:lastRenderedPageBreak/>
-        <w:pict w14:anchorId="5DE73DA9">
+        <w:pict w14:anchorId="37A9C38B">
           <v:rect id="_x0000_i1036" style="width:0;height:1.5pt" o:hralign="center" o:hrstd="t" o:hr="t"/>
         </w:pict>
       </w:r>
@@ -8842,7 +8890,31 @@
           <w:rFonts w:ascii="Calibri" w:hAnsi="Calibri"/>
           <w:sz w:val="22"/>
         </w:rPr>
-        <w:t>GitHub repository (from IRS-PM template) — code, README, installation guide.</w:t>
+        <w:t xml:space="preserve">GitHub repository — </w:t>
+      </w:r>
+      <w:hyperlink r:id="rId11" w:history="1">
+        <w:r>
+          <w:rPr>
+            <w:rStyle w:val="Hyperlink"/>
+            <w:rFonts w:ascii="Calibri" w:hAnsi="Calibri"/>
+            <w:sz w:val="22"/>
+          </w:rPr>
+          <w:t>https://github.com/chanwaijye/IRS-PM-2026-03-29-AIS08-GRP-11-ThePlanner</w:t>
+        </w:r>
+      </w:hyperlink>
+      <w:r>
+        <w:rPr>
+          <w:rFonts w:ascii="Calibri" w:hAnsi="Calibri"/>
+          <w:sz w:val="22"/>
+        </w:rPr>
+        <w:t xml:space="preserve"> </w:t>
+      </w:r>
+      <w:r>
+        <w:rPr>
+          <w:rFonts w:ascii="Calibri" w:hAnsi="Calibri"/>
+          <w:sz w:val="22"/>
+        </w:rPr>
+        <w:t xml:space="preserve"> — code, README, installation guide.</w:t>
       </w:r>
     </w:p>
     <w:p>
@@ -9231,7 +9303,7 @@
           <w:rFonts w:ascii="Calibri" w:hAnsi="Calibri"/>
           <w:sz w:val="22"/>
         </w:rPr>
-        <w:pict w14:anchorId="0B3573FC">
+        <w:pict w14:anchorId="06BF8B55">
           <v:rect id="_x0000_i1037" style="width:0;height:1.5pt" o:hralign="center" o:hrstd="t" o:hr="t"/>
         </w:pict>
       </w:r>
@@ -9296,36 +9368,17 @@
           <w:rFonts w:ascii="Calibri" w:hAnsi="Calibri"/>
           <w:sz w:val="22"/>
         </w:rPr>
-        <w:pict w14:anchorId="1CAF3A21">
+        <w:pict w14:anchorId="7D50FB91">
           <v:rect id="_x0000_i1038" style="width:0;height:1.5pt" o:hralign="center" o:hrstd="t" o:hr="t"/>
         </w:pict>
       </w:r>
     </w:p>
     <w:p>
       <w:pPr>
-        <w:rPr>
-          <w:rFonts w:asciiTheme="majorHAnsi" w:eastAsiaTheme="majorEastAsia" w:hAnsiTheme="majorHAnsi" w:cstheme="majorBidi"/>
-          <w:b/>
-          <w:bCs/>
-          <w:color w:val="1F3864"/>
-          <w:sz w:val="32"/>
-          <w:szCs w:val="28"/>
-        </w:rPr>
+        <w:pStyle w:val="Heading2"/>
       </w:pPr>
       <w:bookmarkStart w:id="37" w:name="X57d2ac0c7dd3a57d64190ff8e9bed559e4527ef"/>
       <w:bookmarkEnd w:id="36"/>
-      <w:r>
-        <w:rPr>
-          <w:color w:val="1F3864"/>
-          <w:sz w:val="32"/>
-        </w:rPr>
-        <w:br w:type="page"/>
-      </w:r>
-    </w:p>
-    <w:p>
-      <w:pPr>
-        <w:pStyle w:val="Heading2"/>
-      </w:pPr>
       <w:r>
         <w:rPr>
           <w:color w:val="1F3864"/>
@@ -10263,7 +10316,7 @@
           <w:rFonts w:ascii="Calibri" w:hAnsi="Calibri"/>
           <w:sz w:val="22"/>
         </w:rPr>
-        <w:pict w14:anchorId="0955C495">
+        <w:pict w14:anchorId="26CFD2A7">
           <v:rect id="_x0000_i1039" style="width:0;height:1.5pt" o:hralign="center" o:hrstd="t" o:hr="t"/>
         </w:pict>
       </w:r>
@@ -10296,7 +10349,7 @@
           <w:sz w:val="22"/>
         </w:rPr>
         <w:drawing>
-          <wp:inline distT="0" distB="0" distL="0" distR="0" wp14:anchorId="3A632B45" wp14:editId="097FD72D">
+          <wp:inline distT="0" distB="0" distL="0" distR="0" wp14:anchorId="0DD11694" wp14:editId="295BF14D">
             <wp:extent cx="1866900" cy="3980497"/>
             <wp:effectExtent l="0" t="0" r="0" b="0"/>
             <wp:docPr id="70" name="Picture"/>
@@ -10311,7 +10364,7 @@
                     </pic:cNvPicPr>
                   </pic:nvPicPr>
                   <pic:blipFill>
-                    <a:blip r:embed="rId10"/>
+                    <a:blip r:embed="rId12"/>
                     <a:stretch>
                       <a:fillRect/>
                     </a:stretch>
@@ -10684,7 +10737,7 @@
           <w:rFonts w:ascii="Calibri" w:hAnsi="Calibri"/>
           <w:sz w:val="22"/>
         </w:rPr>
-        <w:pict w14:anchorId="086E9C6A">
+        <w:pict w14:anchorId="4744E007">
           <v:rect id="_x0000_i1040" style="width:0;height:1.5pt" o:hralign="center" o:hrstd="t" o:hr="t"/>
         </w:pict>
       </w:r>
@@ -10956,7 +11009,7 @@
           <w:rFonts w:ascii="Calibri" w:hAnsi="Calibri"/>
           <w:sz w:val="22"/>
         </w:rPr>
-        <w:pict w14:anchorId="1673316D">
+        <w:pict w14:anchorId="38534A34">
           <v:rect id="_x0000_i1041" style="width:0;height:1.5pt" o:hralign="center" o:hrstd="t" o:hr="t"/>
         </w:pict>
       </w:r>
@@ -10978,7 +11031,7 @@
       <w:bookmarkEnd w:id="42"/>
     </w:p>
     <w:sectPr>
-      <w:footerReference w:type="default" r:id="rId11"/>
+      <w:footerReference w:type="default" r:id="rId13"/>
       <w:pgSz w:w="12240" w:h="15840"/>
       <w:pgMar w:top="1080" w:right="1080" w:bottom="1080" w:left="1080" w:header="720" w:footer="720" w:gutter="0"/>
       <w:cols w:space="720"/>
@@ -11090,7 +11143,7 @@
   <w:abstractNum w:abstractNumId="0" w15:restartNumberingAfterBreak="0">
     <w:nsid w:val="0000A990"/>
     <w:multiLevelType w:val="multilevel"/>
-    <w:tmpl w:val="3244B8D4"/>
+    <w:tmpl w:val="D1B0EA4C"/>
     <w:lvl w:ilvl="0">
       <w:numFmt w:val="bullet"/>
       <w:lvlText w:val=" "/>
@@ -11167,7 +11220,7 @@
   <w:abstractNum w:abstractNumId="1" w15:restartNumberingAfterBreak="0">
     <w:nsid w:val="0000A991"/>
     <w:multiLevelType w:val="multilevel"/>
-    <w:tmpl w:val="9B9A038C"/>
+    <w:tmpl w:val="F43074B6"/>
     <w:lvl w:ilvl="0">
       <w:numFmt w:val="bullet"/>
       <w:lvlText w:val="•"/>
@@ -11241,31 +11294,31 @@
       </w:pPr>
     </w:lvl>
   </w:abstractNum>
-  <w:num w:numId="1" w16cid:durableId="1367095351">
+  <w:num w:numId="1" w16cid:durableId="1741174751">
     <w:abstractNumId w:val="0"/>
   </w:num>
-  <w:num w:numId="2" w16cid:durableId="1115176200">
+  <w:num w:numId="2" w16cid:durableId="1798257413">
     <w:abstractNumId w:val="1"/>
   </w:num>
-  <w:num w:numId="3" w16cid:durableId="1840999120">
+  <w:num w:numId="3" w16cid:durableId="1483542776">
     <w:abstractNumId w:val="1"/>
   </w:num>
-  <w:num w:numId="4" w16cid:durableId="1364789949">
+  <w:num w:numId="4" w16cid:durableId="207958521">
     <w:abstractNumId w:val="1"/>
   </w:num>
-  <w:num w:numId="5" w16cid:durableId="1738167105">
+  <w:num w:numId="5" w16cid:durableId="531069492">
     <w:abstractNumId w:val="1"/>
   </w:num>
-  <w:num w:numId="6" w16cid:durableId="1150170272">
+  <w:num w:numId="6" w16cid:durableId="807863780">
     <w:abstractNumId w:val="1"/>
   </w:num>
-  <w:num w:numId="7" w16cid:durableId="367879377">
+  <w:num w:numId="7" w16cid:durableId="64769822">
     <w:abstractNumId w:val="1"/>
   </w:num>
-  <w:num w:numId="8" w16cid:durableId="1590506302">
+  <w:num w:numId="8" w16cid:durableId="1546985808">
     <w:abstractNumId w:val="1"/>
   </w:num>
-  <w:num w:numId="9" w16cid:durableId="1281835664">
+  <w:num w:numId="9" w16cid:durableId="505749365">
     <w:abstractNumId w:val="1"/>
   </w:num>
 </w:numbering>
@@ -12296,6 +12349,18 @@
       <w:sz w:val="22"/>
     </w:rPr>
   </w:style>
+  <w:style w:type="character" w:styleId="UnresolvedMention">
+    <w:name w:val="Unresolved Mention"/>
+    <w:basedOn w:val="DefaultParagraphFont"/>
+    <w:uiPriority w:val="99"/>
+    <w:semiHidden/>
+    <w:unhideWhenUsed/>
+    <w:rsid w:val="00A3198A"/>
+    <w:rPr>
+      <w:color w:val="605E5C"/>
+      <w:shd w:val="clear" w:color="auto" w:fill="E1DFDD"/>
+    </w:rPr>
+  </w:style>
 </w:styles>
 </file>
 

</xml_diff>